<commit_message>
update journal DS and SC
</commit_message>
<xml_diff>
--- a/Soft Computing/SC_Journal.docx
+++ b/Soft Computing/SC_Journal.docx
@@ -733,10 +733,15 @@
         <w:t xml:space="preserve"> </w:t>
       </w:r>
       <w:r>
-        <w:t>A</w:t>
-      </w:r>
-      <w:r>
-        <w:t>hmed Dilshad Shaikh</w:t>
+        <w:t xml:space="preserve">Mohd </w:t>
+      </w:r>
+      <w:proofErr w:type="spellStart"/>
+      <w:r>
+        <w:t>Sahbaz</w:t>
+      </w:r>
+      <w:proofErr w:type="spellEnd"/>
+      <w:r>
+        <w:t xml:space="preserve"> Chaudhary</w:t>
       </w:r>
     </w:p>
     <w:p>
@@ -1490,15 +1495,25 @@
           <w:sz w:val="20"/>
           <w:u w:val="single"/>
         </w:rPr>
-        <w:t>A</w:t>
-      </w:r>
+        <w:t xml:space="preserve">Mohd </w:t>
+      </w:r>
+      <w:proofErr w:type="spellStart"/>
       <w:r>
         <w:rPr>
           <w:b/>
           <w:sz w:val="20"/>
           <w:u w:val="single"/>
         </w:rPr>
-        <w:t>hmed Dilshad Shaikh</w:t>
+        <w:t>Sahbaz</w:t>
+      </w:r>
+      <w:proofErr w:type="spellEnd"/>
+      <w:r>
+        <w:rPr>
+          <w:b/>
+          <w:sz w:val="20"/>
+          <w:u w:val="single"/>
+        </w:rPr>
+        <w:t xml:space="preserve"> Chaudhary</w:t>
       </w:r>
       <w:r>
         <w:rPr>
@@ -1552,7 +1567,7 @@
           <w:sz w:val="20"/>
           <w:u w:val="single"/>
         </w:rPr>
-        <w:t>9</w:t>
+        <w:t>1</w:t>
       </w:r>
       <w:r>
         <w:rPr>

</xml_diff>